<commit_message>
Put production sample JSON in the verification Result fields.
Replace the Result placeholder text with the Invoice, Order, Product, Route, SalesRep, Customer, Stock, and Warehouse payloads from production.

Co-authored-by: soniarun532-rgb <soniarun532-rgb@users.noreply.github.com>
</commit_message>
<xml_diff>
--- a/docs/SAT-Datashare-Production-Endpoint-Verification.docx
+++ b/docs/SAT-Datashare-Production-Endpoint-Verification.docx
@@ -191,14 +191,13 @@
             <w:shd w:fill="C6EFCE" w:val="clear"/>
           </w:tcPr>
           <w:p>
-            <w:r/>
             <w:r>
               <w:rPr>
-                <w:rFonts w:ascii="Calibri" w:hAnsi="Calibri"/>
+                <w:rFonts w:ascii="Calibri" w:hAnsi="Calibri" w:cs="Calibri"/>
                 <w:b w:val="0"/>
                 <w:sz w:val="22"/>
               </w:rPr>
-              <w:t>Working as expected</w:t>
+              <w:t>Sample JSON below</w:t>
             </w:r>
           </w:p>
         </w:tc>
@@ -258,14 +257,13 @@
             <w:shd w:fill="C6EFCE" w:val="clear"/>
           </w:tcPr>
           <w:p>
-            <w:r/>
             <w:r>
               <w:rPr>
-                <w:rFonts w:ascii="Calibri" w:hAnsi="Calibri"/>
+                <w:rFonts w:ascii="Calibri" w:hAnsi="Calibri" w:cs="Calibri"/>
                 <w:b w:val="0"/>
                 <w:sz w:val="22"/>
               </w:rPr>
-              <w:t>Working as expected</w:t>
+              <w:t>Sample JSON below</w:t>
             </w:r>
           </w:p>
         </w:tc>
@@ -325,14 +323,13 @@
             <w:shd w:fill="C6EFCE" w:val="clear"/>
           </w:tcPr>
           <w:p>
-            <w:r/>
             <w:r>
               <w:rPr>
-                <w:rFonts w:ascii="Calibri" w:hAnsi="Calibri"/>
+                <w:rFonts w:ascii="Calibri" w:hAnsi="Calibri" w:cs="Calibri"/>
                 <w:b w:val="0"/>
                 <w:sz w:val="22"/>
               </w:rPr>
-              <w:t>Working as expected</w:t>
+              <w:t>Sample JSON below</w:t>
             </w:r>
           </w:p>
         </w:tc>
@@ -392,14 +389,13 @@
             <w:shd w:fill="C6EFCE" w:val="clear"/>
           </w:tcPr>
           <w:p>
-            <w:r/>
             <w:r>
               <w:rPr>
-                <w:rFonts w:ascii="Calibri" w:hAnsi="Calibri"/>
+                <w:rFonts w:ascii="Calibri" w:hAnsi="Calibri" w:cs="Calibri"/>
                 <w:b w:val="0"/>
                 <w:sz w:val="22"/>
               </w:rPr>
-              <w:t>Working as expected</w:t>
+              <w:t>Sample JSON below</w:t>
             </w:r>
           </w:p>
         </w:tc>
@@ -459,14 +455,13 @@
             <w:shd w:fill="C6EFCE" w:val="clear"/>
           </w:tcPr>
           <w:p>
-            <w:r/>
             <w:r>
               <w:rPr>
-                <w:rFonts w:ascii="Calibri" w:hAnsi="Calibri"/>
+                <w:rFonts w:ascii="Calibri" w:hAnsi="Calibri" w:cs="Calibri"/>
                 <w:b w:val="0"/>
                 <w:sz w:val="22"/>
               </w:rPr>
-              <w:t>Working as expected</w:t>
+              <w:t>Sample JSON below</w:t>
             </w:r>
           </w:p>
         </w:tc>
@@ -526,14 +521,13 @@
             <w:shd w:fill="C6EFCE" w:val="clear"/>
           </w:tcPr>
           <w:p>
-            <w:r/>
             <w:r>
               <w:rPr>
-                <w:rFonts w:ascii="Calibri" w:hAnsi="Calibri"/>
+                <w:rFonts w:ascii="Calibri" w:hAnsi="Calibri" w:cs="Calibri"/>
                 <w:b w:val="0"/>
                 <w:sz w:val="22"/>
               </w:rPr>
-              <w:t>Working as expected</w:t>
+              <w:t>Sample JSON below</w:t>
             </w:r>
           </w:p>
         </w:tc>
@@ -593,14 +587,13 @@
             <w:shd w:fill="C6EFCE" w:val="clear"/>
           </w:tcPr>
           <w:p>
-            <w:r/>
             <w:r>
               <w:rPr>
-                <w:rFonts w:ascii="Calibri" w:hAnsi="Calibri"/>
+                <w:rFonts w:ascii="Calibri" w:hAnsi="Calibri" w:cs="Calibri"/>
                 <w:b w:val="0"/>
                 <w:sz w:val="22"/>
               </w:rPr>
-              <w:t>Working as expected</w:t>
+              <w:t>Sample JSON below</w:t>
             </w:r>
           </w:p>
         </w:tc>
@@ -660,14 +653,13 @@
             <w:shd w:fill="C6EFCE" w:val="clear"/>
           </w:tcPr>
           <w:p>
-            <w:r/>
             <w:r>
               <w:rPr>
-                <w:rFonts w:ascii="Calibri" w:hAnsi="Calibri"/>
+                <w:rFonts w:ascii="Calibri" w:hAnsi="Calibri" w:cs="Calibri"/>
                 <w:b w:val="0"/>
                 <w:sz w:val="22"/>
               </w:rPr>
-              <w:t>Working as expected</w:t>
+              <w:t>Sample JSON below</w:t>
             </w:r>
           </w:p>
         </w:tc>
@@ -827,14 +819,55 @@
             <w:shd w:fill="C6EFCE" w:val="clear"/>
           </w:tcPr>
           <w:p>
-            <w:r/>
+            <w:pPr>
+              <w:spacing w:before="0" w:after="0" w:line="240"/>
+            </w:pPr>
             <w:r>
               <w:rPr>
-                <w:rFonts w:ascii="Calibri" w:hAnsi="Calibri"/>
+                <w:rFonts w:ascii="Consolas" w:hAnsi="Consolas" w:cs="Consolas"/>
                 <w:b w:val="0"/>
-                <w:sz w:val="22"/>
+                <w:color w:val="1A1A1A"/>
+                <w:sz w:val="18"/>
               </w:rPr>
-              <w:t>Working as expected</w:t>
+              <w:t>{</w:t>
+              <w:br/>
+              <w:t xml:space="preserve">            "STOREID": 2655,</w:t>
+              <w:br/>
+              <w:t xml:space="preserve">            "Discount": 0,</w:t>
+              <w:br/>
+              <w:t xml:space="preserve">            "SalesRepID": 111,</w:t>
+              <w:br/>
+              <w:t xml:space="preserve">            "VATAmount": "80.46",</w:t>
+              <w:br/>
+              <w:t xml:space="preserve">            "RouteID": "",</w:t>
+              <w:br/>
+              <w:t xml:space="preserve">            "DistributorID": "1000097205",</w:t>
+              <w:br/>
+              <w:t xml:space="preserve">            "ProductID": "3286535",</w:t>
+              <w:br/>
+              <w:t xml:space="preserve">            "WarehouseID": 1925,</w:t>
+              <w:br/>
+              <w:t xml:space="preserve">            "OrderNumber": 265,</w:t>
+              <w:br/>
+              <w:t xml:space="preserve">            "InvoiceNumber": 2857,</w:t>
+              <w:br/>
+              <w:t xml:space="preserve">            "InvoiceDate": "24/09/2026",</w:t>
+              <w:br/>
+              <w:t xml:space="preserve">            "InvoiceTime": "15:46:26",</w:t>
+              <w:br/>
+              <w:t xml:space="preserve">            "InvoiceStatus": "Delivered",</w:t>
+              <w:br/>
+              <w:t xml:space="preserve">            "UnitOfMeasure": "PIECE",</w:t>
+              <w:br/>
+              <w:t xml:space="preserve">            "Currency": "KES",</w:t>
+              <w:br/>
+              <w:t xml:space="preserve">            "QuantityInvoiced": 10,</w:t>
+              <w:br/>
+              <w:t xml:space="preserve">            "AmountInvoiced": "583.30",</w:t>
+              <w:br/>
+              <w:t xml:space="preserve">            "TransType": "Sale"</w:t>
+              <w:br/>
+              <w:t>}</w:t>
             </w:r>
           </w:p>
         </w:tc>
@@ -889,15 +922,7 @@
         </w:drawing>
       </w:r>
     </w:p>
-    <w:p>
-      <w:r>
-        <w:rPr>
-          <w:rFonts w:ascii="Calibri" w:hAnsi="Calibri"/>
-          <w:sz w:val="22"/>
-        </w:rPr>
-        <w:t>Working as expected. Returns mapped invoice rows. DistributorID is 1000097205, InvoiceStatus is Delivered, VATAmount is 2 decimals.</w:t>
-      </w:r>
-    </w:p>
+    <w:p/>
     <w:p>
       <w:r>
         <w:br w:type="page"/>
@@ -1052,14 +1077,53 @@
             <w:shd w:fill="C6EFCE" w:val="clear"/>
           </w:tcPr>
           <w:p>
-            <w:r/>
+            <w:pPr>
+              <w:spacing w:before="0" w:after="0" w:line="240"/>
+            </w:pPr>
             <w:r>
               <w:rPr>
-                <w:rFonts w:ascii="Calibri" w:hAnsi="Calibri"/>
+                <w:rFonts w:ascii="Consolas" w:hAnsi="Consolas" w:cs="Consolas"/>
                 <w:b w:val="0"/>
-                <w:sz w:val="22"/>
+                <w:color w:val="1A1A1A"/>
+                <w:sz w:val="18"/>
               </w:rPr>
-              <w:t>Working as expected</w:t>
+              <w:t>{</w:t>
+              <w:br/>
+              <w:t xml:space="preserve">            "StoreID": 2348,</w:t>
+              <w:br/>
+              <w:t xml:space="preserve">            "SalesRepID": 108,</w:t>
+              <w:br/>
+              <w:t xml:space="preserve">            "RouteID": "",</w:t>
+              <w:br/>
+              <w:t xml:space="preserve">            "ProductID": "3049801",</w:t>
+              <w:br/>
+              <w:t xml:space="preserve">            "DistributorID": "1000097205",</w:t>
+              <w:br/>
+              <w:t xml:space="preserve">            "WarehouseID": 2503,</w:t>
+              <w:br/>
+              <w:t xml:space="preserve">            "OrderNumber": 320,</w:t>
+              <w:br/>
+              <w:t xml:space="preserve">            "OrderDate": "24/09/2026",</w:t>
+              <w:br/>
+              <w:t xml:space="preserve">            "OrderStartTime": "",</w:t>
+              <w:br/>
+              <w:t xml:space="preserve">            "OrderEndTime": "",</w:t>
+              <w:br/>
+              <w:t xml:space="preserve">            "OrderStatus": "Open",</w:t>
+              <w:br/>
+              <w:t xml:space="preserve">            "UnitOfMeasure": "PIECE",</w:t>
+              <w:br/>
+              <w:t xml:space="preserve">            "Currency": "KES",</w:t>
+              <w:br/>
+              <w:t xml:space="preserve">            "QuantityOrdered": 5,</w:t>
+              <w:br/>
+              <w:t xml:space="preserve">            "AmountOrdered": "590.90",</w:t>
+              <w:br/>
+              <w:t xml:space="preserve">            "Discount": 0,</w:t>
+              <w:br/>
+              <w:t xml:space="preserve">            "VATAmount": "81.50"</w:t>
+              <w:br/>
+              <w:t>}</w:t>
             </w:r>
           </w:p>
         </w:tc>
@@ -1114,15 +1178,7 @@
         </w:drawing>
       </w:r>
     </w:p>
-    <w:p>
-      <w:r>
-        <w:rPr>
-          <w:rFonts w:ascii="Calibri" w:hAnsi="Calibri"/>
-          <w:sz w:val="22"/>
-        </w:rPr>
-        <w:t>Working as expected. Returns mapped order rows. DistributorID is 1000097205. OrderDate is populated from ENTRY_TIME.</w:t>
-      </w:r>
-    </w:p>
+    <w:p/>
     <w:p>
       <w:r>
         <w:br w:type="page"/>
@@ -1277,14 +1333,25 @@
             <w:shd w:fill="C6EFCE" w:val="clear"/>
           </w:tcPr>
           <w:p>
-            <w:r/>
+            <w:pPr>
+              <w:spacing w:before="0" w:after="0" w:line="240"/>
+            </w:pPr>
             <w:r>
               <w:rPr>
-                <w:rFonts w:ascii="Calibri" w:hAnsi="Calibri"/>
+                <w:rFonts w:ascii="Consolas" w:hAnsi="Consolas" w:cs="Consolas"/>
                 <w:b w:val="0"/>
-                <w:sz w:val="22"/>
+                <w:color w:val="1A1A1A"/>
+                <w:sz w:val="18"/>
               </w:rPr>
-              <w:t>Working as expected</w:t>
+              <w:t>{</w:t>
+              <w:br/>
+              <w:t xml:space="preserve">            "ProductID": "3268896",</w:t>
+              <w:br/>
+              <w:t xml:space="preserve">            "ProductSKU": "AWICK FRESHMATIC ROSE  + GADGET SEEDING PRICE 250ML (4)",</w:t>
+              <w:br/>
+              <w:t xml:space="preserve">            "UnitofMeasure": "PIECE"</w:t>
+              <w:br/>
+              <w:t>}</w:t>
             </w:r>
           </w:p>
         </w:tc>
@@ -1339,15 +1406,7 @@
         </w:drawing>
       </w:r>
     </w:p>
-    <w:p>
-      <w:r>
-        <w:rPr>
-          <w:rFonts w:ascii="Calibri" w:hAnsi="Calibri"/>
-          <w:sz w:val="22"/>
-        </w:rPr>
-        <w:t>Working as expected. Returns only ProductID, ProductSKU, and UnitofMeasure.</w:t>
-      </w:r>
-    </w:p>
+    <w:p/>
     <w:p>
       <w:r>
         <w:br w:type="page"/>
@@ -1502,14 +1561,31 @@
             <w:shd w:fill="C6EFCE" w:val="clear"/>
           </w:tcPr>
           <w:p>
-            <w:r/>
+            <w:pPr>
+              <w:spacing w:before="0" w:after="0" w:line="240"/>
+            </w:pPr>
             <w:r>
               <w:rPr>
-                <w:rFonts w:ascii="Calibri" w:hAnsi="Calibri"/>
+                <w:rFonts w:ascii="Consolas" w:hAnsi="Consolas" w:cs="Consolas"/>
                 <w:b w:val="0"/>
-                <w:sz w:val="22"/>
+                <w:color w:val="1A1A1A"/>
+                <w:sz w:val="18"/>
               </w:rPr>
-              <w:t>Working as expected</w:t>
+              <w:t>{</w:t>
+              <w:br/>
+              <w:t xml:space="preserve">            "RouteID": 110,</w:t>
+              <w:br/>
+              <w:t xml:space="preserve">            "RouteName": "MOSES RB TUESDAY",</w:t>
+              <w:br/>
+              <w:t xml:space="preserve">            "SalesRepID": 110,</w:t>
+              <w:br/>
+              <w:t xml:space="preserve">            "RouteType": "Weekly",</w:t>
+              <w:br/>
+              <w:t xml:space="preserve">            "SalesRepType": "Van Sales",</w:t>
+              <w:br/>
+              <w:t xml:space="preserve">            "Date": "07/09/2026"</w:t>
+              <w:br/>
+              <w:t>}</w:t>
             </w:r>
           </w:p>
         </w:tc>
@@ -1564,15 +1640,7 @@
         </w:drawing>
       </w:r>
     </w:p>
-    <w:p>
-      <w:r>
-        <w:rPr>
-          <w:rFonts w:ascii="Calibri" w:hAnsi="Calibri"/>
-          <w:sz w:val="22"/>
-        </w:rPr>
-        <w:t>Working as expected. Returns RouteID, RouteName, SalesRepID, RouteType, SalesRepType, and Date.</w:t>
-      </w:r>
-    </w:p>
+    <w:p/>
     <w:p>
       <w:r>
         <w:br w:type="page"/>
@@ -1727,14 +1795,29 @@
             <w:shd w:fill="C6EFCE" w:val="clear"/>
           </w:tcPr>
           <w:p>
-            <w:r/>
+            <w:pPr>
+              <w:spacing w:before="0" w:after="0" w:line="240"/>
+            </w:pPr>
             <w:r>
               <w:rPr>
-                <w:rFonts w:ascii="Calibri" w:hAnsi="Calibri"/>
+                <w:rFonts w:ascii="Consolas" w:hAnsi="Consolas" w:cs="Consolas"/>
                 <w:b w:val="0"/>
-                <w:sz w:val="22"/>
+                <w:color w:val="1A1A1A"/>
+                <w:sz w:val="18"/>
               </w:rPr>
-              <w:t>Working as expected</w:t>
+              <w:t>{</w:t>
+              <w:br/>
+              <w:t xml:space="preserve">            "SalesRepID": 100,</w:t>
+              <w:br/>
+              <w:t xml:space="preserve">            "SalesRepName": "ISAAC MUGE",</w:t>
+              <w:br/>
+              <w:t xml:space="preserve">            "DistributorID": "1000097205",</w:t>
+              <w:br/>
+              <w:t xml:space="preserve">            "WarehouseID": 183,</w:t>
+              <w:br/>
+              <w:t xml:space="preserve">            "SalesRepType": "Admin"</w:t>
+              <w:br/>
+              <w:t>}</w:t>
             </w:r>
           </w:p>
         </w:tc>
@@ -1789,15 +1872,7 @@
         </w:drawing>
       </w:r>
     </w:p>
-    <w:p>
-      <w:r>
-        <w:rPr>
-          <w:rFonts w:ascii="Calibri" w:hAnsi="Calibri"/>
-          <w:sz w:val="22"/>
-        </w:rPr>
-        <w:t>Working as expected. Returns SalesRepID, SalesRepName, DistributorID 1000097205, WarehouseID, and SalesRepType.</w:t>
-      </w:r>
-    </w:p>
+    <w:p/>
     <w:p>
       <w:r>
         <w:br w:type="page"/>
@@ -1952,14 +2027,47 @@
             <w:shd w:fill="C6EFCE" w:val="clear"/>
           </w:tcPr>
           <w:p>
-            <w:r/>
+            <w:pPr>
+              <w:spacing w:before="0" w:after="0" w:line="240"/>
+            </w:pPr>
             <w:r>
               <w:rPr>
-                <w:rFonts w:ascii="Calibri" w:hAnsi="Calibri"/>
+                <w:rFonts w:ascii="Consolas" w:hAnsi="Consolas" w:cs="Consolas"/>
                 <w:b w:val="0"/>
-                <w:sz w:val="22"/>
+                <w:color w:val="1A1A1A"/>
+                <w:sz w:val="18"/>
               </w:rPr>
-              <w:t>Working as expected</w:t>
+              <w:t>{</w:t>
+              <w:br/>
+              <w:t xml:space="preserve">            "StoreID": 1980,</w:t>
+              <w:br/>
+              <w:t xml:space="preserve">            "StoreName": "ONE ZERO ONE SELFRIGES",</w:t>
+              <w:br/>
+              <w:t xml:space="preserve">            "StoreCategory": "SHOP AND BROWSER",</w:t>
+              <w:br/>
+              <w:t xml:space="preserve">            "Channel": "GENERAL TRADE",</w:t>
+              <w:br/>
+              <w:t xml:space="preserve">            "StoreClassification": "GENERAL TRADE",</w:t>
+              <w:br/>
+              <w:t xml:space="preserve">            "WarehouseID": null,</w:t>
+              <w:br/>
+              <w:t xml:space="preserve">            "Longitude": 37.5852265,</w:t>
+              <w:br/>
+              <w:t xml:space="preserve">            "Latitude": 0.3526255,</w:t>
+              <w:br/>
+              <w:t xml:space="preserve">            "City": "MERU",</w:t>
+              <w:br/>
+              <w:t xml:space="preserve">            "Region": "MOUNTAIN",</w:t>
+              <w:br/>
+              <w:t xml:space="preserve">            "County": "",</w:t>
+              <w:br/>
+              <w:t xml:space="preserve">            "StoreStatus": 1,</w:t>
+              <w:br/>
+              <w:t xml:space="preserve">            "StoreCreationDate": "10/09/2026",</w:t>
+              <w:br/>
+              <w:t xml:space="preserve">            "StoreSize": ""</w:t>
+              <w:br/>
+              <w:t>}</w:t>
             </w:r>
           </w:p>
         </w:tc>
@@ -2014,15 +2122,7 @@
         </w:drawing>
       </w:r>
     </w:p>
-    <w:p>
-      <w:r>
-        <w:rPr>
-          <w:rFonts w:ascii="Calibri" w:hAnsi="Calibri"/>
-          <w:sz w:val="22"/>
-        </w:rPr>
-        <w:t>Working as expected. Returns store fields. WarehouseID is null as agreed.</w:t>
-      </w:r>
-    </w:p>
+    <w:p/>
     <w:p>
       <w:r>
         <w:br w:type="page"/>
@@ -2177,14 +2277,31 @@
             <w:shd w:fill="C6EFCE" w:val="clear"/>
           </w:tcPr>
           <w:p>
-            <w:r/>
+            <w:pPr>
+              <w:spacing w:before="0" w:after="0" w:line="240"/>
+            </w:pPr>
             <w:r>
               <w:rPr>
-                <w:rFonts w:ascii="Calibri" w:hAnsi="Calibri"/>
+                <w:rFonts w:ascii="Consolas" w:hAnsi="Consolas" w:cs="Consolas"/>
                 <w:b w:val="0"/>
-                <w:sz w:val="22"/>
+                <w:color w:val="1A1A1A"/>
+                <w:sz w:val="18"/>
               </w:rPr>
-              <w:t>Working as expected</w:t>
+              <w:t>{</w:t>
+              <w:br/>
+              <w:t xml:space="preserve">            "ProductSKU": "3300090",</w:t>
+              <w:br/>
+              <w:t xml:space="preserve">            "UnitofMeasure": "PIECE",</w:t>
+              <w:br/>
+              <w:t xml:space="preserve">            "DistributorWarehouseCode": "EMBU STOCKPOINT",</w:t>
+              <w:br/>
+              <w:t xml:space="preserve">            "Date": "22/09/2026",</w:t>
+              <w:br/>
+              <w:t xml:space="preserve">            "InventoryQuantity": 21,</w:t>
+              <w:br/>
+              <w:t xml:space="preserve">            "InventoryPrice": null</w:t>
+              <w:br/>
+              <w:t>}</w:t>
             </w:r>
           </w:p>
         </w:tc>
@@ -2239,15 +2356,7 @@
         </w:drawing>
       </w:r>
     </w:p>
-    <w:p>
-      <w:r>
-        <w:rPr>
-          <w:rFonts w:ascii="Calibri" w:hAnsi="Calibri"/>
-          <w:sz w:val="22"/>
-        </w:rPr>
-        <w:t>Working as expected. Returns ProductSKU, UnitofMeasure, DistributorWarehouseCode, Date, and InventoryQuantity. InventoryPrice is null as agreed.</w:t>
-      </w:r>
-    </w:p>
+    <w:p/>
     <w:p>
       <w:r>
         <w:br w:type="page"/>
@@ -2402,14 +2511,25 @@
             <w:shd w:fill="C6EFCE" w:val="clear"/>
           </w:tcPr>
           <w:p>
-            <w:r/>
+            <w:pPr>
+              <w:spacing w:before="0" w:after="0" w:line="240"/>
+            </w:pPr>
             <w:r>
               <w:rPr>
-                <w:rFonts w:ascii="Calibri" w:hAnsi="Calibri"/>
+                <w:rFonts w:ascii="Consolas" w:hAnsi="Consolas" w:cs="Consolas"/>
                 <w:b w:val="0"/>
-                <w:sz w:val="22"/>
+                <w:color w:val="1A1A1A"/>
+                <w:sz w:val="18"/>
               </w:rPr>
-              <w:t>Working as expected</w:t>
+              <w:t>{</w:t>
+              <w:br/>
+              <w:t xml:space="preserve">            "WarehouseID": 183,</w:t>
+              <w:br/>
+              <w:t xml:space="preserve">            "WarehouseName": "GIKAMBURA STOCKPOINT",</w:t>
+              <w:br/>
+              <w:t xml:space="preserve">            "DistributorID": "1000097205"</w:t>
+              <w:br/>
+              <w:t>}</w:t>
             </w:r>
           </w:p>
         </w:tc>
@@ -2464,15 +2584,7 @@
         </w:drawing>
       </w:r>
     </w:p>
-    <w:p>
-      <w:r>
-        <w:rPr>
-          <w:rFonts w:ascii="Calibri" w:hAnsi="Calibri"/>
-          <w:sz w:val="22"/>
-        </w:rPr>
-        <w:t>Working as expected. Returns WarehouseID, WarehouseName, and DistributorID 1000097205.</w:t>
-      </w:r>
-    </w:p>
+    <w:p/>
     <w:sectPr>
       <w:pgSz w:w="12240" w:h="15840"/>
       <w:pgMar w:top="907" w:right="1020" w:bottom="907" w:left="1020" w:header="720" w:footer="720" w:gutter="0"/>

</xml_diff>